<commit_message>
fix(ui): de-green — avatar do usuario p/ azul + verde-menta legado p/ ciano
O botao de usuario (e o avatar do modal Meu Perfil) usavam o accent
verde-menta antigo; agora sao azul --primary com texto branco. Varre o
verde legado remanescente: familia --teal-* -> ciano, rgba(93,202,165)
e rgba(25,201,160) -> rgba(0,184,201), badges para_assinatura/aprovado
-> ciano, e fallbacks mortos (#5DCAA5/#0d1a0d/#2a4a3a/#6a7a6a/#4caf82)
neutralizados. --warn (ambar) e --err (coral) mantidos. Grep de verde
= zero. Registra no DEV_LOG (Sessao 68) e no docx de padrao.

Co-Authored-By: Claude Opus 4.8 (1M context) <noreply@anthropic.com>
</commit_message>
<xml_diff>
--- a/Padrao_Design_Orizon_v10.docx
+++ b/Padrao_Design_Orizon_v10.docx
@@ -6718,6 +6718,17 @@
     <w:p>
       <w:r>
         <w:t>Removidos: --gold, --dalm-gold, --dalm-gold-light. Toda a UI segue .modal-box + tokens (nunca hex fixo). As imagens orizon_design_reference_dark/_light.png ficam desatualizadas (refazer quando quiser).</w:t>
+      </w:r>
+    </w:p>
+    <w:p>
+      <w:r>
+        <w:rPr>
+          <w:b/>
+        </w:rPr>
+        <w:t xml:space="preserve">De-green (rev. 2026-07-12): </w:t>
+      </w:r>
+      <w:r>
+        <w:t>o accent legado era verde-menta; toda ocorrência de verde fora dos tokens de marca foi convertida para o ciano/azul da identidade — família --teal-* (cards de valor financeiro) repontada para ciano, mints rgba(93,202,165)/emerald rgba(25,201,160) → rgba(0,184,201), badges 'para_assinatura'/'aprovado' → ciano, e o avatar do usuário → azul --primary. --warn (âmbar) e --err (coral/vermelho) permanecem como únicas cores quentes.</w:t>
       </w:r>
     </w:p>
     <w:sectPr>

</xml_diff>